<commit_message>
feat: initialize omnistats pipeline with modular Bayesian, causal, and APA reporting architecture
</commit_message>
<xml_diff>
--- a/omnistats/outputs/apa_report.docx
+++ b/omnistats/outputs/apa_report.docx
@@ -4684,7 +4684,7 @@
                 <w:i w:val="0"/>
                 <w:sz w:val="22"/>
               </w:rPr>
-              <w:t>importance_sampling_normal</w:t>
+              <w:t>pytorch_hmc_studentt</w:t>
             </w:r>
           </w:p>
         </w:tc>
@@ -4768,7 +4768,7 @@
                 <w:i w:val="0"/>
                 <w:sz w:val="22"/>
               </w:rPr>
-              <w:t>11.4188</w:t>
+              <w:t>6.2728</w:t>
             </w:r>
           </w:p>
         </w:tc>
@@ -4796,7 +4796,7 @@
                 <w:i w:val="0"/>
                 <w:sz w:val="22"/>
               </w:rPr>
-              <w:t>28.7064</w:t>
+              <w:t>10.9770</w:t>
             </w:r>
           </w:p>
         </w:tc>
@@ -4824,7 +4824,7 @@
                 <w:i w:val="0"/>
                 <w:sz w:val="22"/>
               </w:rPr>
-              <w:t>4317.6</w:t>
+              <w:t>734.7</w:t>
             </w:r>
           </w:p>
         </w:tc>
@@ -4866,7 +4866,7 @@
           <w:i/>
           <w:sz w:val="20"/>
         </w:rPr>
-        <w:t>Note. P(B &gt; A) = posterior probability that Treatment exceeds Control. Expected Loss = E[max(0, θ_A − θ_B) | Data] (EVSI decision criterion). ESS = Effective Sample Size of posterior draws. Method: conjugate_beta_binomial = exact Beta-Binomial conjugate update; pymc_nuts_studentt = PyMC No-U-Turn Sampler with StudentT likelihood (robust to outliers); importance_sampling = IS fallback when PyMC unavailable. Decision threshold: P(B &gt; A) ≥ 0.95 and Expected Loss ≤ 0.01.</w:t>
+        <w:t>Note. P(B &gt; A) = posterior probability that Treatment exceeds Control. Expected Loss = E[max(0, θ_A − θ_B) | Data] (EVSI decision criterion). ESS = Effective Sample Size of posterior draws. Method: conjugate_beta_binomial = exact Beta-Binomial conjugate update; pymc_nuts_studentt = PyMC No-U-Turn Sampler with StudentT likelihood (robust to outliers). Decision threshold: P(B &gt; A) ≥ 0.95 and Expected Loss ≤ 0.01.</w:t>
       </w:r>
     </w:p>
     <w:p>

</xml_diff>

<commit_message>
feat: implement Stage 5 Bayesian time-series counterfactual analysis using Pyro BSTS and integrate into the main pipeline documentation.
</commit_message>
<xml_diff>
--- a/omnistats/outputs/apa_report.docx
+++ b/omnistats/outputs/apa_report.docx
@@ -4684,7 +4684,7 @@
                 <w:i w:val="0"/>
                 <w:sz w:val="22"/>
               </w:rPr>
-              <w:t>pytorch_hmc_studentt</w:t>
+              <w:t>pymc_nuts_studentt</w:t>
             </w:r>
           </w:p>
         </w:tc>
@@ -4768,7 +4768,7 @@
                 <w:i w:val="0"/>
                 <w:sz w:val="22"/>
               </w:rPr>
-              <w:t>6.2728</w:t>
+              <w:t>6.3160</w:t>
             </w:r>
           </w:p>
         </w:tc>
@@ -4796,7 +4796,7 @@
                 <w:i w:val="0"/>
                 <w:sz w:val="22"/>
               </w:rPr>
-              <w:t>10.9770</w:t>
+              <w:t>10.8793</w:t>
             </w:r>
           </w:p>
         </w:tc>
@@ -4824,7 +4824,7 @@
                 <w:i w:val="0"/>
                 <w:sz w:val="22"/>
               </w:rPr>
-              <w:t>734.7</w:t>
+              <w:t>4169.5</w:t>
             </w:r>
           </w:p>
         </w:tc>
@@ -4866,7 +4866,7 @@
           <w:i/>
           <w:sz w:val="20"/>
         </w:rPr>
-        <w:t>Note. P(B &gt; A) = posterior probability that Treatment exceeds Control. Expected Loss = E[max(0, θ_A − θ_B) | Data] (EVSI decision criterion). ESS = Effective Sample Size of posterior draws. Method: conjugate_beta_binomial = exact Beta-Binomial conjugate update; pymc_nuts_studentt = PyMC No-U-Turn Sampler with StudentT likelihood (robust to outliers). Decision threshold: P(B &gt; A) ≥ 0.95 and Expected Loss ≤ 0.01.</w:t>
+        <w:t>Note. P(B &gt; A) = posterior probability that Treatment exceeds Control. Expected Loss = E[max(0, θ_A − θ_B) | Data] (EVSI decision criterion). ESS = Effective Sample Size of posterior draws. Method: conjugate_beta_binomial = exact Beta-Binomial conjugate update; pymc_nuts_studentt = PyMC No-U-Turn Sampler with StudentT likelihood (robust to outliers); importance_sampling = IS fallback when PyMC unavailable. Decision threshold: P(B &gt; A) ≥ 0.95 and Expected Loss ≤ 0.01.</w:t>
       </w:r>
     </w:p>
     <w:p>

</xml_diff>

<commit_message>
feat: implement causal inference module with DR-OLS HTE estimator and standardized results reporting
</commit_message>
<xml_diff>
--- a/omnistats/outputs/apa_report.docx
+++ b/omnistats/outputs/apa_report.docx
@@ -4111,6 +4111,128 @@
           <w:tcPr>
             <w:tcW w:type="dxa" w:w="1440"/>
             <w:vAlign w:val="center"/>
+          </w:tcPr>
+          <w:p>
+            <w:pPr>
+              <w:jc w:val="left"/>
+            </w:pPr>
+            <w:r>
+              <w:rPr>
+                <w:rFonts w:ascii="Times New Roman" w:hAnsi="Times New Roman"/>
+                <w:b w:val="0"/>
+                <w:i w:val="0"/>
+                <w:sz w:val="22"/>
+              </w:rPr>
+              <w:t>dist_trt</w:t>
+            </w:r>
+          </w:p>
+        </w:tc>
+        <w:tc>
+          <w:tcPr>
+            <w:tcW w:type="dxa" w:w="1440"/>
+            <w:vAlign w:val="center"/>
+          </w:tcPr>
+          <w:p>
+            <w:pPr>
+              <w:jc w:val="right"/>
+            </w:pPr>
+            <w:r>
+              <w:rPr>
+                <w:rFonts w:ascii="Times New Roman" w:hAnsi="Times New Roman"/>
+                <w:b w:val="0"/>
+                <w:i w:val="0"/>
+                <w:sz w:val="22"/>
+              </w:rPr>
+              <w:t>0.0</w:t>
+            </w:r>
+          </w:p>
+        </w:tc>
+        <w:tc>
+          <w:tcPr>
+            <w:tcW w:type="dxa" w:w="1440"/>
+            <w:vAlign w:val="center"/>
+          </w:tcPr>
+          <w:p>
+            <w:pPr>
+              <w:jc w:val="right"/>
+            </w:pPr>
+            <w:r>
+              <w:rPr>
+                <w:rFonts w:ascii="Times New Roman" w:hAnsi="Times New Roman"/>
+                <w:b w:val="0"/>
+                <w:i w:val="0"/>
+                <w:sz w:val="22"/>
+              </w:rPr>
+              <w:t>True</w:t>
+            </w:r>
+          </w:p>
+        </w:tc>
+        <w:tc>
+          <w:tcPr>
+            <w:tcW w:type="dxa" w:w="1440"/>
+            <w:vAlign w:val="center"/>
+          </w:tcPr>
+          <w:p>
+            <w:pPr>
+              <w:jc w:val="right"/>
+            </w:pPr>
+            <w:r>
+              <w:rPr>
+                <w:rFonts w:ascii="Times New Roman" w:hAnsi="Times New Roman"/>
+                <w:b w:val="0"/>
+                <w:i w:val="0"/>
+                <w:sz w:val="22"/>
+              </w:rPr>
+              <w:t>nan</w:t>
+            </w:r>
+          </w:p>
+        </w:tc>
+        <w:tc>
+          <w:tcPr>
+            <w:tcW w:type="dxa" w:w="1440"/>
+            <w:vAlign w:val="center"/>
+          </w:tcPr>
+          <w:p>
+            <w:pPr>
+              <w:jc w:val="right"/>
+            </w:pPr>
+            <w:r>
+              <w:rPr>
+                <w:rFonts w:ascii="Times New Roman" w:hAnsi="Times New Roman"/>
+                <w:b w:val="0"/>
+                <w:i w:val="0"/>
+                <w:sz w:val="22"/>
+              </w:rPr>
+              <w:t>nan</w:t>
+            </w:r>
+          </w:p>
+        </w:tc>
+        <w:tc>
+          <w:tcPr>
+            <w:tcW w:type="dxa" w:w="1440"/>
+            <w:vAlign w:val="center"/>
+          </w:tcPr>
+          <w:p>
+            <w:pPr>
+              <w:jc w:val="right"/>
+            </w:pPr>
+            <w:r>
+              <w:rPr>
+                <w:rFonts w:ascii="Times New Roman" w:hAnsi="Times New Roman"/>
+                <w:b w:val="0"/>
+                <w:i w:val="0"/>
+                <w:sz w:val="22"/>
+              </w:rPr>
+              <w:t>nan</w:t>
+            </w:r>
+          </w:p>
+        </w:tc>
+      </w:tr>
+      <w:tr>
+        <w:tc>
+          <w:tcPr>
+            <w:tcW w:type="dxa" w:w="1440"/>
+            <w:vAlign w:val="center"/>
             <w:tcBorders>
               <w:top w:val="none"/>
               <w:left w:val="none"/>
@@ -4131,7 +4253,7 @@
                 <w:i w:val="0"/>
                 <w:sz w:val="22"/>
               </w:rPr>
-              <w:t>dist_trt</w:t>
+              <w:t>mmd_rkhs</w:t>
             </w:r>
           </w:p>
         </w:tc>
@@ -4159,7 +4281,7 @@
                 <w:i w:val="0"/>
                 <w:sz w:val="22"/>
               </w:rPr>
-              <w:t>0.0</w:t>
+              <w:t>nan</w:t>
             </w:r>
           </w:p>
         </w:tc>
@@ -6184,7 +6306,7 @@
                 <w:i w:val="0"/>
                 <w:sz w:val="22"/>
               </w:rPr>
-              <w:t>CausalImpact (BSTS)</w:t>
+              <w:t>CausalImpact (Pyro BSTS SVI)</w:t>
             </w:r>
           </w:p>
         </w:tc>
@@ -6240,7 +6362,7 @@
                 <w:i w:val="0"/>
                 <w:sz w:val="22"/>
               </w:rPr>
-              <w:t>—</w:t>
+              <w:t>4.9857</w:t>
             </w:r>
           </w:p>
         </w:tc>
@@ -6296,7 +6418,7 @@
                 <w:i w:val="0"/>
                 <w:sz w:val="22"/>
               </w:rPr>
-              <w:t>—</w:t>
+              <w:t>4.0907</w:t>
             </w:r>
           </w:p>
         </w:tc>
@@ -6324,7 +6446,7 @@
                 <w:i w:val="0"/>
                 <w:sz w:val="22"/>
               </w:rPr>
-              <w:t>—</w:t>
+              <w:t>5.8592</w:t>
             </w:r>
           </w:p>
         </w:tc>
@@ -6352,7 +6474,7 @@
                 <w:i w:val="0"/>
                 <w:sz w:val="22"/>
               </w:rPr>
-              <w:t>not_available</w:t>
+              <w:t>pyro_svi_credible</w:t>
             </w:r>
           </w:p>
         </w:tc>
@@ -6380,7 +6502,7 @@
                 <w:i w:val="0"/>
                 <w:sz w:val="22"/>
               </w:rPr>
-              <w:t>—</w:t>
+              <w:t>0.0000</w:t>
             </w:r>
           </w:p>
         </w:tc>

</xml_diff>